<commit_message>
Chỉnh sửa form dự án
</commit_message>
<xml_diff>
--- a/web/public/templates/project_plan_template.docx
+++ b/web/public/templates/project_plan_template.docx
@@ -16,7 +16,7 @@
           <w:sz w:val="32"/>
           <w:szCs w:val="32"/>
         </w:rPr>
-        <w:t xml:space="preserve">MAU KE HOACH DU AN NHOM</w:t>
+        <w:t xml:space="preserve">MẪU KẾ HOẠCH DỰ ÁN NHÓM</w:t>
       </w:r>
     </w:p>
     <w:p>
@@ -33,7 +33,7 @@
           <w:sz w:val="20"/>
           <w:szCs w:val="20"/>
         </w:rPr>
-        <w:t xml:space="preserve">Dien thong tin du an cua nhom ban vao cac muc ben duoi, sau do dinh kem file nay vao tro ly AI BeaverDash de duoc ho tro lap ke hoach tu dong.</w:t>
+        <w:t xml:space="preserve">Điền thông tin dự án của nhóm bạn vào các mục bên dưới, sau đó đính kèm file này vào trợ lý AI BeaverDash để được hỗ trợ lập kế hoạch tự động.</w:t>
       </w:r>
     </w:p>
     <w:p>
@@ -42,7 +42,7 @@
         <w:spacing w:after="100" w:before="300"/>
       </w:pPr>
       <w:r>
-        <w:t xml:space="preserve">1. THONG TIN DU AN</w:t>
+        <w:t xml:space="preserve">1. THÔNG TIN DỰ ÁN</w:t>
       </w:r>
     </w:p>
     <w:p>
@@ -58,7 +58,7 @@
           <w:sz w:val="20"/>
           <w:szCs w:val="20"/>
         </w:rPr>
-        <w:t xml:space="preserve">(Dien cac thong tin co ban cua du an)</w:t>
+        <w:t xml:space="preserve">(Điền các thông tin cơ bản của dự án)</w:t>
       </w:r>
     </w:p>
     <w:p>
@@ -76,7 +76,7 @@
           <w:sz w:val="22"/>
           <w:szCs w:val="22"/>
         </w:rPr>
-        <w:t xml:space="preserve">Ten du an:</w:t>
+        <w:t xml:space="preserve">Tên dự án:</w:t>
       </w:r>
     </w:p>
     <w:p>
@@ -94,7 +94,7 @@
           <w:sz w:val="22"/>
           <w:szCs w:val="22"/>
         </w:rPr>
-        <w:t xml:space="preserve">Mo ta ngan gon du an:</w:t>
+        <w:t xml:space="preserve">Mô tả ngắn gọn dự án:</w:t>
       </w:r>
     </w:p>
     <w:p>
@@ -112,7 +112,7 @@
           <w:sz w:val="22"/>
           <w:szCs w:val="22"/>
         </w:rPr>
-        <w:t xml:space="preserve">Ngay bat dau:</w:t>
+        <w:t xml:space="preserve">Ngày bắt đầu:</w:t>
       </w:r>
     </w:p>
     <w:p>
@@ -130,7 +130,7 @@
           <w:sz w:val="22"/>
           <w:szCs w:val="22"/>
         </w:rPr>
-        <w:t xml:space="preserve">Ngay ket thuc:</w:t>
+        <w:t xml:space="preserve">Ngày kết thúc:</w:t>
       </w:r>
     </w:p>
     <w:p>
@@ -144,7 +144,7 @@
         <w:spacing w:after="100" w:before="300"/>
       </w:pPr>
       <w:r>
-        <w:t xml:space="preserve">2. THANH VIEN NHOM</w:t>
+        <w:t xml:space="preserve">2. THÀNH VIÊN NHÓM</w:t>
       </w:r>
     </w:p>
     <w:p>
@@ -160,7 +160,7 @@
           <w:sz w:val="20"/>
           <w:szCs w:val="20"/>
         </w:rPr>
-        <w:t xml:space="preserve">(Liet ke cac thanh vien trong nhom va the manh cua tung nguoi de AI phan cong cong viec phu hop)</w:t>
+        <w:t xml:space="preserve">(Liệt kê các thành viên trong nhóm và thế mạnh của từng người để AI phân công công việc phù hợp)</w:t>
       </w:r>
     </w:p>
     <w:tbl>
@@ -199,7 +199,7 @@
                 <w:sz w:val="20"/>
                 <w:szCs w:val="20"/>
               </w:rPr>
-              <w:t xml:space="preserve">Ho va ten</w:t>
+              <w:t xml:space="preserve">Họ và tên</w:t>
             </w:r>
           </w:p>
         </w:tc>
@@ -221,7 +221,7 @@
                 <w:sz w:val="20"/>
                 <w:szCs w:val="20"/>
               </w:rPr>
-              <w:t xml:space="preserve">Vai tro</w:t>
+              <w:t xml:space="preserve">Vai trò</w:t>
             </w:r>
           </w:p>
         </w:tc>
@@ -243,7 +243,7 @@
                 <w:sz w:val="20"/>
                 <w:szCs w:val="20"/>
               </w:rPr>
-              <w:t xml:space="preserve">The manh / Ky nang</w:t>
+              <w:t xml:space="preserve">Thế mạnh / Kỹ năng</w:t>
             </w:r>
           </w:p>
         </w:tc>
@@ -269,7 +269,7 @@
                 <w:sz w:val="20"/>
                 <w:szCs w:val="20"/>
               </w:rPr>
-              <w:t xml:space="preserve">[Ho ten thanh vien]</w:t>
+              <w:t xml:space="preserve">[Họ tên thành viên]</w:t>
             </w:r>
           </w:p>
         </w:tc>
@@ -293,7 +293,7 @@
                 <w:sz w:val="20"/>
                 <w:szCs w:val="20"/>
               </w:rPr>
-              <w:t xml:space="preserve">[Truong nhom / Thanh vien]</w:t>
+              <w:t xml:space="preserve">[Trưởng nhóm / Thành viên]</w:t>
             </w:r>
           </w:p>
         </w:tc>
@@ -317,7 +317,7 @@
                 <w:sz w:val="20"/>
                 <w:szCs w:val="20"/>
               </w:rPr>
-              <w:t xml:space="preserve">[Linh vuc gioi, ky nang noi bat]</w:t>
+              <w:t xml:space="preserve">[Lĩnh vực giỏi, kỹ năng nổi bật]</w:t>
             </w:r>
           </w:p>
         </w:tc>
@@ -482,7 +482,7 @@
         <w:spacing w:after="100" w:before="300"/>
       </w:pPr>
       <w:r>
-        <w:t xml:space="preserve">3. CAC GIAI DOAN THUC HIEN (SPRINT)</w:t>
+        <w:t xml:space="preserve">3. CÁC GIAI ĐOẠN THỰC HIỆN (SPRINT)</w:t>
       </w:r>
     </w:p>
     <w:p>
@@ -498,7 +498,7 @@
           <w:sz w:val="20"/>
           <w:szCs w:val="20"/>
         </w:rPr>
-        <w:t xml:space="preserve">(Chia du an thanh cac giai doan de AI gan cong viec vao tung giai doan tuong ung)</w:t>
+        <w:t xml:space="preserve">(Chia dự án thành các giai đoạn để AI gán công việc vào từng giai đoạn tương ứng)</w:t>
       </w:r>
     </w:p>
     <w:tbl>
@@ -537,7 +537,7 @@
                 <w:sz w:val="20"/>
                 <w:szCs w:val="20"/>
               </w:rPr>
-              <w:t xml:space="preserve">Ten giai doan</w:t>
+              <w:t xml:space="preserve">Tên giai đoạn</w:t>
             </w:r>
           </w:p>
         </w:tc>
@@ -559,7 +559,7 @@
                 <w:sz w:val="20"/>
                 <w:szCs w:val="20"/>
               </w:rPr>
-              <w:t xml:space="preserve">Muc tieu</w:t>
+              <w:t xml:space="preserve">Mục tiêu</w:t>
             </w:r>
           </w:p>
         </w:tc>
@@ -581,7 +581,7 @@
                 <w:sz w:val="20"/>
                 <w:szCs w:val="20"/>
               </w:rPr>
-              <w:t xml:space="preserve">Thoi gian</w:t>
+              <w:t xml:space="preserve">Thời gian</w:t>
             </w:r>
           </w:p>
         </w:tc>
@@ -607,7 +607,7 @@
                 <w:sz w:val="20"/>
                 <w:szCs w:val="20"/>
               </w:rPr>
-              <w:t xml:space="preserve">[VD: Giai doan 1]</w:t>
+              <w:t xml:space="preserve">[VD: Giai đoạn 1]</w:t>
             </w:r>
           </w:p>
         </w:tc>
@@ -631,7 +631,7 @@
                 <w:sz w:val="20"/>
                 <w:szCs w:val="20"/>
               </w:rPr>
-              <w:t xml:space="preserve">[VD: Tim hieu yeu cau, khao sat]</w:t>
+              <w:t xml:space="preserve">[VD: Tìm hiểu yêu cầu, khảo sát]</w:t>
             </w:r>
           </w:p>
         </w:tc>
@@ -681,7 +681,7 @@
                 <w:sz w:val="20"/>
                 <w:szCs w:val="20"/>
               </w:rPr>
-              <w:t xml:space="preserve">[VD: Giai doan 2]</w:t>
+              <w:t xml:space="preserve">[VD: Giai đoạn 2]</w:t>
             </w:r>
           </w:p>
         </w:tc>
@@ -705,7 +705,7 @@
                 <w:sz w:val="20"/>
                 <w:szCs w:val="20"/>
               </w:rPr>
-              <w:t xml:space="preserve">[VD: Thuc hien chinh]</w:t>
+              <w:t xml:space="preserve">[VD: Thực hiện chính]</w:t>
             </w:r>
           </w:p>
         </w:tc>
@@ -820,7 +820,7 @@
         <w:spacing w:after="100" w:before="300"/>
       </w:pPr>
       <w:r>
-        <w:t xml:space="preserve">4. DANH SACH CONG VIEC CAN LAM</w:t>
+        <w:t xml:space="preserve">4. DANH SÁCH CÔNG VIỆC CẦN LÀM</w:t>
       </w:r>
     </w:p>
     <w:p>
@@ -836,7 +836,7 @@
           <w:sz w:val="20"/>
           <w:szCs w:val="20"/>
         </w:rPr>
-        <w:t xml:space="preserve">(Liet ke cac dau viec lon va cac viec nho ben trong. AI se dua vao day de tao cong viec va phan cong cho thanh vien.)</w:t>
+        <w:t xml:space="preserve">(Liệt kê các đầu việc lớn và các việc nhỏ bên trong. AI sẽ dựa vào đây để tạo công việc và phân công cho thành viên.)</w:t>
       </w:r>
     </w:p>
     <w:p>
@@ -856,7 +856,7 @@
           <w:sz w:val="22"/>
           <w:szCs w:val="22"/>
         </w:rPr>
-        <w:t xml:space="preserve">Cong viec 1: [Ten cong viec chinh]</w:t>
+        <w:t xml:space="preserve">Công việc 1: [Tên công việc chính]</w:t>
       </w:r>
     </w:p>
     <w:p>
@@ -874,7 +874,7 @@
           <w:sz w:val="22"/>
           <w:szCs w:val="22"/>
         </w:rPr>
-        <w:t xml:space="preserve">Muc do uu tien: [Bat buoc / Quan trong / Mo rong]</w:t>
+        <w:t xml:space="preserve">Mức độ ưu tiên: [Bắt buộc / Quan trọng / Mở rộng]</w:t>
       </w:r>
     </w:p>
     <w:p>
@@ -892,7 +892,7 @@
           <w:sz w:val="22"/>
           <w:szCs w:val="22"/>
         </w:rPr>
-        <w:t xml:space="preserve">Giai doan du kien: [Giai doan 1 / Giai doan 2 / ...]</w:t>
+        <w:t xml:space="preserve">Giai đoạn dự kiến: [Giai đoạn 1 / Giai đoạn 2 / ...]</w:t>
       </w:r>
     </w:p>
     <w:p>
@@ -910,7 +910,7 @@
           <w:sz w:val="22"/>
           <w:szCs w:val="22"/>
         </w:rPr>
-        <w:t xml:space="preserve">Cac viec nho:</w:t>
+        <w:t xml:space="preserve">Các việc nhỏ:</w:t>
       </w:r>
     </w:p>
     <w:p>
@@ -926,7 +926,7 @@
           <w:sz w:val="20"/>
           <w:szCs w:val="20"/>
         </w:rPr>
-        <w:t xml:space="preserve">  - [Viec nho 1]</w:t>
+        <w:t xml:space="preserve">  - [Việc nhỏ 1]</w:t>
       </w:r>
     </w:p>
     <w:p>
@@ -942,7 +942,7 @@
           <w:sz w:val="20"/>
           <w:szCs w:val="20"/>
         </w:rPr>
-        <w:t xml:space="preserve">  - [Viec nho 2]</w:t>
+        <w:t xml:space="preserve">  - [Việc nhỏ 2]</w:t>
       </w:r>
     </w:p>
     <w:p>
@@ -962,7 +962,7 @@
           <w:sz w:val="22"/>
           <w:szCs w:val="22"/>
         </w:rPr>
-        <w:t xml:space="preserve">Cong viec 2: [Ten cong viec chinh]</w:t>
+        <w:t xml:space="preserve">Công việc 2: [Tên công việc chính]</w:t>
       </w:r>
     </w:p>
     <w:p>
@@ -980,7 +980,7 @@
           <w:sz w:val="22"/>
           <w:szCs w:val="22"/>
         </w:rPr>
-        <w:t xml:space="preserve">Muc do uu tien: [Bat buoc / Quan trong / Mo rong]</w:t>
+        <w:t xml:space="preserve">Mức độ ưu tiên: [Bắt buộc / Quan trọng / Mở rộng]</w:t>
       </w:r>
     </w:p>
     <w:p>
@@ -998,7 +998,7 @@
           <w:sz w:val="22"/>
           <w:szCs w:val="22"/>
         </w:rPr>
-        <w:t xml:space="preserve">Giai doan du kien: [...]</w:t>
+        <w:t xml:space="preserve">Giai đoạn dự kiến: [...]</w:t>
       </w:r>
     </w:p>
     <w:p>
@@ -1016,7 +1016,7 @@
           <w:sz w:val="22"/>
           <w:szCs w:val="22"/>
         </w:rPr>
-        <w:t xml:space="preserve">Cac viec nho: [...]</w:t>
+        <w:t xml:space="preserve">Các việc nhỏ: [...]</w:t>
       </w:r>
     </w:p>
     <w:p>
@@ -1037,7 +1037,7 @@
           <w:sz w:val="20"/>
           <w:szCs w:val="20"/>
         </w:rPr>
-        <w:t xml:space="preserve">(Them cac cong viec tiep theo theo cung cau truc...)</w:t>
+        <w:t xml:space="preserve">(Thêm các công việc tiếp theo theo cùng cấu trúc...)</w:t>
       </w:r>
     </w:p>
     <w:p>
@@ -1051,7 +1051,7 @@
         <w:spacing w:after="100" w:before="300"/>
       </w:pPr>
       <w:r>
-        <w:t xml:space="preserve">5. GHI CHU THEM</w:t>
+        <w:t xml:space="preserve">5. GHI CHÚ THÊM</w:t>
       </w:r>
     </w:p>
     <w:p>
@@ -1067,7 +1067,7 @@
           <w:sz w:val="20"/>
           <w:szCs w:val="20"/>
         </w:rPr>
-        <w:t xml:space="preserve">(Ghi bat ky yeu cau hoac luu y dac biet nao cho du an)</w:t>
+        <w:t xml:space="preserve">(Ghi bất kỳ yêu cầu hoặc lưu ý đặc biệt nào cho dự án)</w:t>
       </w:r>
     </w:p>
     <w:p>
@@ -1085,7 +1085,7 @@
           <w:sz w:val="22"/>
           <w:szCs w:val="22"/>
         </w:rPr>
-        <w:t xml:space="preserve">[VD: Can nop bao cao giua ky vao ngay ...]</w:t>
+        <w:t xml:space="preserve">[VD: Cần nộp báo cáo giữa kỳ vào ngày ...]</w:t>
       </w:r>
     </w:p>
     <w:p>
@@ -1103,7 +1103,7 @@
           <w:sz w:val="22"/>
           <w:szCs w:val="22"/>
         </w:rPr>
-        <w:t xml:space="preserve">[VD: Giao vien huong dan yeu cau ...]</w:t>
+        <w:t xml:space="preserve">[VD: Giáo viên hướng dẫn yêu cầu ...]</w:t>
       </w:r>
     </w:p>
     <w:p>
@@ -1139,7 +1139,7 @@
           <w:sz w:val="20"/>
           <w:szCs w:val="20"/>
         </w:rPr>
-        <w:t xml:space="preserve">Huong dan: </w:t>
+        <w:t xml:space="preserve">Hướng dẫn: </w:t>
       </w:r>
       <w:r>
         <w:rPr>
@@ -1148,7 +1148,7 @@
           <w:sz w:val="20"/>
           <w:szCs w:val="20"/>
         </w:rPr>
-        <w:t xml:space="preserve">Dien xong -&gt; mo tro ly AI BeaverDash -&gt; dinh kem file nay -&gt; go </w:t>
+        <w:t xml:space="preserve">Điền xong -&gt; mở trợ lý AI BeaverDash -&gt; đính kèm file này -&gt; gõ </w:t>
       </w:r>
       <w:r>
         <w:rPr>
@@ -1161,7 +1161,7 @@
           <w:sz w:val="20"/>
           <w:szCs w:val="20"/>
         </w:rPr>
-        <w:t xml:space="preserve">"Hay lap ke hoach du an dua tren tai lieu dinh kem"</w:t>
+        <w:t xml:space="preserve">"Hãy lập kế hoạch dự án dựa trên tài liệu đính kèm"</w:t>
       </w:r>
       <w:r>
         <w:rPr>
@@ -1170,7 +1170,7 @@
           <w:sz w:val="20"/>
           <w:szCs w:val="20"/>
         </w:rPr>
-        <w:t xml:space="preserve">. AI se tu dong tao cong viec, phan cong cho thanh vien va sap xep vao tung giai doan.</w:t>
+        <w:t xml:space="preserve">. AI sẽ tự động tạo công việc, phân công cho thành viên và sắp xếp vào từng giai đoạn.</w:t>
       </w:r>
     </w:p>
     <w:sectPr>

</xml_diff>